<commit_message>
test: add requirements traceability coverage
Co-authored-by: Copilot <223556219+Copilot@users.noreply.github.com>
</commit_message>
<xml_diff>
--- a/Questionnaire.docx
+++ b/Questionnaire.docx
@@ -273,6 +273,14 @@
       </w:pPr>
       <w:r>
         <w:t>I also strengthened the prompts to use supplied evidence only and added tests for invented content and unknown IDs. The main lesson was that prompt instructions help, but hallucination controls must also exist in code.</w:t>
+      </w:r>
+    </w:p>
+    <w:p>
+      <w:pPr>
+        <w:keepLines/>
+      </w:pPr>
+      <w:r>
+        <w:t>I found a second issue during the spec-to-test traceability review. The specification said story categories were restricted to an approved engineering allowlist, but the UserStory model accepted any string. This was not a model hallucination by itself, but it created a gap where an AI response could return an unsupported category and still pass type validation. I identified it while mapping every functional requirement to a test case. I replaced the unrestricted string with the same typed category allowlist used by requirements, added negative tests for invalid categories and priorities, and included the check in the traceability matrix. This showed why specifications, generated tests, and code must be reviewed together rather than trusting any one of them alone.</w:t>
       </w:r>
     </w:p>
     <w:p>

</xml_diff>

<commit_message>
docs: remove questionnaire drafting note
Co-authored-by: Copilot <223556219+Copilot@users.noreply.github.com>
</commit_message>
<xml_diff>
--- a/Questionnaire.docx
+++ b/Questionnaire.docx
@@ -22,17 +22,6 @@
           <w:sz w:val="22"/>
         </w:rPr>
         <w:t>Suggested responses based on Smart Backlog Assistant</w:t>
-      </w:r>
-    </w:p>
-    <w:p>
-      <w:r>
-        <w:rPr>
-          <w:b/>
-        </w:rPr>
-        <w:t xml:space="preserve">Note: </w:t>
-      </w:r>
-      <w:r>
-        <w:t>These responses are written as concise first-person examples. Adjust any statement about your personal contribution before submission.</w:t>
       </w:r>
     </w:p>
     <w:p>

</xml_diff>